<commit_message>
Add teacher picture annotations and expand lesson plans
</commit_message>
<xml_diff>
--- a/Term-1/Grade-10/Chapter-1-Listening-1-Nice-to-Meet-You-Part-1/assets/Lesson-Plan-Nice-to-Meet-You-Part-1.docx
+++ b/Term-1/Grade-10/Chapter-1-Listening-1-Nice-to-Meet-You-Part-1/assets/Lesson-Plan-Nice-to-Meet-You-Part-1.docx
@@ -66,7 +66,7 @@
               <w:rPr>
                 <w:rFonts w:ascii="Arial" w:hAnsi="Arial"/>
                 <w:b/>
-                <w:sz w:val="16"/>
+                <w:sz w:val="14"/>
               </w:rPr>
               <w:t>التاريخ</w:t>
               <w:br/>
@@ -88,7 +88,7 @@
               <w:rPr>
                 <w:rFonts w:ascii="Arial" w:hAnsi="Arial"/>
                 <w:b w:val="0"/>
-                <w:sz w:val="16"/>
+                <w:sz w:val="14"/>
               </w:rPr>
               <w:t>____________</w:t>
             </w:r>
@@ -109,7 +109,7 @@
               <w:rPr>
                 <w:rFonts w:ascii="Arial" w:hAnsi="Arial"/>
                 <w:b/>
-                <w:sz w:val="16"/>
+                <w:sz w:val="14"/>
               </w:rPr>
               <w:t>المادة الدراسية</w:t>
               <w:br/>
@@ -131,7 +131,7 @@
               <w:rPr>
                 <w:rFonts w:ascii="Arial" w:hAnsi="Arial"/>
                 <w:b w:val="0"/>
-                <w:sz w:val="16"/>
+                <w:sz w:val="14"/>
               </w:rPr>
               <w:t>English Language</w:t>
             </w:r>
@@ -152,7 +152,7 @@
               <w:rPr>
                 <w:rFonts w:ascii="Arial" w:hAnsi="Arial"/>
                 <w:b/>
-                <w:sz w:val="16"/>
+                <w:sz w:val="14"/>
               </w:rPr>
               <w:t>المعلم</w:t>
               <w:br/>
@@ -174,7 +174,7 @@
               <w:rPr>
                 <w:rFonts w:ascii="Arial" w:hAnsi="Arial"/>
                 <w:b w:val="0"/>
-                <w:sz w:val="16"/>
+                <w:sz w:val="14"/>
               </w:rPr>
               <w:t>Saidah Khwar</w:t>
             </w:r>
@@ -195,7 +195,7 @@
               <w:rPr>
                 <w:rFonts w:ascii="Arial" w:hAnsi="Arial"/>
                 <w:b/>
-                <w:sz w:val="16"/>
+                <w:sz w:val="14"/>
               </w:rPr>
               <w:t>عنوان الدرس</w:t>
               <w:br/>
@@ -217,7 +217,7 @@
               <w:rPr>
                 <w:rFonts w:ascii="Arial" w:hAnsi="Arial"/>
                 <w:b w:val="0"/>
-                <w:sz w:val="16"/>
+                <w:sz w:val="14"/>
               </w:rPr>
               <w:t>Listening 1 · Nice to Meet You · Part 1 · Day 1</w:t>
             </w:r>
@@ -240,7 +240,7 @@
               <w:rPr>
                 <w:rFonts w:ascii="Arial" w:hAnsi="Arial"/>
                 <w:b/>
-                <w:sz w:val="16"/>
+                <w:sz w:val="14"/>
               </w:rPr>
               <w:t>موضوع الدرس</w:t>
               <w:br/>
@@ -263,7 +263,7 @@
               <w:rPr>
                 <w:rFonts w:ascii="Arial" w:hAnsi="Arial"/>
                 <w:b w:val="0"/>
-                <w:sz w:val="16"/>
+                <w:sz w:val="14"/>
               </w:rPr>
               <w:t>First meetings, informal expressions and stressed words</w:t>
               <w:br/>
@@ -279,7 +279,7 @@
               <w:rPr>
                 <w:rFonts w:ascii="Arial" w:hAnsi="Arial"/>
                 <w:b w:val="0"/>
-                <w:sz w:val="16"/>
+                <w:sz w:val="14"/>
               </w:rPr>
             </w:r>
           </w:p>
@@ -299,7 +299,7 @@
               <w:rPr>
                 <w:rFonts w:ascii="Arial" w:hAnsi="Arial"/>
                 <w:b/>
-                <w:sz w:val="16"/>
+                <w:sz w:val="14"/>
               </w:rPr>
               <w:t>مخرجات التعلم</w:t>
               <w:br/>
@@ -322,7 +322,7 @@
               <w:rPr>
                 <w:rFonts w:ascii="Arial" w:hAnsi="Arial"/>
                 <w:b w:val="0"/>
-                <w:sz w:val="16"/>
+                <w:sz w:val="14"/>
               </w:rPr>
               <w:t>Students will be able to:</w:t>
               <w:br/>
@@ -344,7 +344,7 @@
               <w:rPr>
                 <w:rFonts w:ascii="Arial" w:hAnsi="Arial"/>
                 <w:b w:val="0"/>
-                <w:sz w:val="16"/>
+                <w:sz w:val="14"/>
               </w:rPr>
             </w:r>
           </w:p>
@@ -357,7 +357,7 @@
               <w:rPr>
                 <w:rFonts w:ascii="Arial" w:hAnsi="Arial"/>
                 <w:b w:val="0"/>
-                <w:sz w:val="16"/>
+                <w:sz w:val="14"/>
               </w:rPr>
             </w:r>
           </w:p>
@@ -370,7 +370,7 @@
               <w:rPr>
                 <w:rFonts w:ascii="Arial" w:hAnsi="Arial"/>
                 <w:b w:val="0"/>
-                <w:sz w:val="16"/>
+                <w:sz w:val="14"/>
               </w:rPr>
             </w:r>
           </w:p>
@@ -392,7 +392,7 @@
               <w:rPr>
                 <w:rFonts w:ascii="Arial" w:hAnsi="Arial"/>
                 <w:b/>
-                <w:sz w:val="16"/>
+                <w:sz w:val="14"/>
               </w:rPr>
               <w:t>سؤال مهارات التفكير العليا</w:t>
               <w:br/>
@@ -415,7 +415,7 @@
               <w:rPr>
                 <w:rFonts w:ascii="Arial" w:hAnsi="Arial"/>
                 <w:b w:val="0"/>
-                <w:sz w:val="16"/>
+                <w:sz w:val="14"/>
               </w:rPr>
               <w:t>How do word choice and sentence stress affect a first impression? Support your answer with an example.</w:t>
             </w:r>
@@ -429,7 +429,7 @@
               <w:rPr>
                 <w:rFonts w:ascii="Arial" w:hAnsi="Arial"/>
                 <w:b w:val="0"/>
-                <w:sz w:val="16"/>
+                <w:sz w:val="14"/>
               </w:rPr>
             </w:r>
           </w:p>
@@ -442,7 +442,7 @@
               <w:rPr>
                 <w:rFonts w:ascii="Arial" w:hAnsi="Arial"/>
                 <w:b w:val="0"/>
-                <w:sz w:val="16"/>
+                <w:sz w:val="14"/>
               </w:rPr>
             </w:r>
           </w:p>
@@ -455,7 +455,7 @@
               <w:rPr>
                 <w:rFonts w:ascii="Arial" w:hAnsi="Arial"/>
                 <w:b w:val="0"/>
-                <w:sz w:val="16"/>
+                <w:sz w:val="14"/>
               </w:rPr>
             </w:r>
           </w:p>
@@ -468,7 +468,7 @@
               <w:rPr>
                 <w:rFonts w:ascii="Arial" w:hAnsi="Arial"/>
                 <w:b w:val="0"/>
-                <w:sz w:val="16"/>
+                <w:sz w:val="14"/>
               </w:rPr>
             </w:r>
           </w:p>
@@ -481,7 +481,7 @@
               <w:rPr>
                 <w:rFonts w:ascii="Arial" w:hAnsi="Arial"/>
                 <w:b w:val="0"/>
-                <w:sz w:val="16"/>
+                <w:sz w:val="14"/>
               </w:rPr>
             </w:r>
           </w:p>
@@ -494,7 +494,7 @@
               <w:rPr>
                 <w:rFonts w:ascii="Arial" w:hAnsi="Arial"/>
                 <w:b w:val="0"/>
-                <w:sz w:val="16"/>
+                <w:sz w:val="14"/>
               </w:rPr>
             </w:r>
           </w:p>
@@ -516,7 +516,7 @@
               <w:rPr>
                 <w:rFonts w:ascii="Arial" w:hAnsi="Arial"/>
                 <w:b/>
-                <w:sz w:val="16"/>
+                <w:sz w:val="14"/>
               </w:rPr>
               <w:t>المفردات الجديدة</w:t>
               <w:br/>
@@ -539,7 +539,7 @@
               <w:rPr>
                 <w:rFonts w:ascii="Arial" w:hAnsi="Arial"/>
                 <w:b w:val="0"/>
-                <w:sz w:val="16"/>
+                <w:sz w:val="14"/>
               </w:rPr>
               <w:t>catch you later · hang out · in person · grab something to eat · stress · content word · first impression</w:t>
             </w:r>
@@ -553,7 +553,7 @@
               <w:rPr>
                 <w:rFonts w:ascii="Arial" w:hAnsi="Arial"/>
                 <w:b w:val="0"/>
-                <w:sz w:val="16"/>
+                <w:sz w:val="14"/>
               </w:rPr>
             </w:r>
           </w:p>
@@ -566,7 +566,7 @@
               <w:rPr>
                 <w:rFonts w:ascii="Arial" w:hAnsi="Arial"/>
                 <w:b w:val="0"/>
-                <w:sz w:val="16"/>
+                <w:sz w:val="14"/>
               </w:rPr>
             </w:r>
           </w:p>
@@ -579,7 +579,7 @@
               <w:rPr>
                 <w:rFonts w:ascii="Arial" w:hAnsi="Arial"/>
                 <w:b w:val="0"/>
-                <w:sz w:val="16"/>
+                <w:sz w:val="14"/>
               </w:rPr>
             </w:r>
           </w:p>
@@ -592,7 +592,7 @@
               <w:rPr>
                 <w:rFonts w:ascii="Arial" w:hAnsi="Arial"/>
                 <w:b w:val="0"/>
-                <w:sz w:val="16"/>
+                <w:sz w:val="14"/>
               </w:rPr>
             </w:r>
           </w:p>
@@ -605,7 +605,7 @@
               <w:rPr>
                 <w:rFonts w:ascii="Arial" w:hAnsi="Arial"/>
                 <w:b w:val="0"/>
-                <w:sz w:val="16"/>
+                <w:sz w:val="14"/>
               </w:rPr>
             </w:r>
           </w:p>
@@ -618,7 +618,7 @@
               <w:rPr>
                 <w:rFonts w:ascii="Arial" w:hAnsi="Arial"/>
                 <w:b w:val="0"/>
-                <w:sz w:val="16"/>
+                <w:sz w:val="14"/>
               </w:rPr>
             </w:r>
           </w:p>
@@ -641,7 +641,7 @@
               <w:rPr>
                 <w:rFonts w:ascii="Arial" w:hAnsi="Arial"/>
                 <w:b/>
-                <w:sz w:val="16"/>
+                <w:sz w:val="14"/>
               </w:rPr>
               <w:t>Lesson Procedures · سير الدرس</w:t>
             </w:r>
@@ -655,7 +655,7 @@
               <w:rPr>
                 <w:rFonts w:ascii="Arial" w:hAnsi="Arial"/>
                 <w:b/>
-                <w:sz w:val="16"/>
+                <w:sz w:val="14"/>
               </w:rPr>
             </w:r>
           </w:p>
@@ -668,7 +668,7 @@
               <w:rPr>
                 <w:rFonts w:ascii="Arial" w:hAnsi="Arial"/>
                 <w:b/>
-                <w:sz w:val="16"/>
+                <w:sz w:val="14"/>
               </w:rPr>
             </w:r>
           </w:p>
@@ -681,7 +681,7 @@
               <w:rPr>
                 <w:rFonts w:ascii="Arial" w:hAnsi="Arial"/>
                 <w:b/>
-                <w:sz w:val="16"/>
+                <w:sz w:val="14"/>
               </w:rPr>
             </w:r>
           </w:p>
@@ -694,7 +694,7 @@
               <w:rPr>
                 <w:rFonts w:ascii="Arial" w:hAnsi="Arial"/>
                 <w:b/>
-                <w:sz w:val="16"/>
+                <w:sz w:val="14"/>
               </w:rPr>
             </w:r>
           </w:p>
@@ -707,7 +707,7 @@
               <w:rPr>
                 <w:rFonts w:ascii="Arial" w:hAnsi="Arial"/>
                 <w:b/>
-                <w:sz w:val="16"/>
+                <w:sz w:val="14"/>
               </w:rPr>
             </w:r>
           </w:p>
@@ -720,7 +720,7 @@
               <w:rPr>
                 <w:rFonts w:ascii="Arial" w:hAnsi="Arial"/>
                 <w:b/>
-                <w:sz w:val="16"/>
+                <w:sz w:val="14"/>
               </w:rPr>
             </w:r>
           </w:p>
@@ -733,7 +733,7 @@
               <w:rPr>
                 <w:rFonts w:ascii="Arial" w:hAnsi="Arial"/>
                 <w:b/>
-                <w:sz w:val="16"/>
+                <w:sz w:val="14"/>
               </w:rPr>
             </w:r>
           </w:p>
@@ -755,7 +755,7 @@
               <w:rPr>
                 <w:rFonts w:ascii="Arial" w:hAnsi="Arial"/>
                 <w:b/>
-                <w:sz w:val="16"/>
+                <w:sz w:val="14"/>
               </w:rPr>
               <w:t>معايير النجاح</w:t>
               <w:br/>
@@ -778,7 +778,7 @@
               <w:rPr>
                 <w:rFonts w:ascii="Arial" w:hAnsi="Arial"/>
                 <w:b w:val="0"/>
-                <w:sz w:val="16"/>
+                <w:sz w:val="14"/>
               </w:rPr>
               <w:t>Students match 6 expressions, confirm listening details with evidence, explain the stress rule, and complete at least 12 of 16 stressed-word blanks.</w:t>
             </w:r>
@@ -792,7 +792,7 @@
               <w:rPr>
                 <w:rFonts w:ascii="Arial" w:hAnsi="Arial"/>
                 <w:b w:val="0"/>
-                <w:sz w:val="16"/>
+                <w:sz w:val="14"/>
               </w:rPr>
             </w:r>
           </w:p>
@@ -805,7 +805,7 @@
               <w:rPr>
                 <w:rFonts w:ascii="Arial" w:hAnsi="Arial"/>
                 <w:b w:val="0"/>
-                <w:sz w:val="16"/>
+                <w:sz w:val="14"/>
               </w:rPr>
             </w:r>
           </w:p>
@@ -818,7 +818,7 @@
               <w:rPr>
                 <w:rFonts w:ascii="Arial" w:hAnsi="Arial"/>
                 <w:b w:val="0"/>
-                <w:sz w:val="16"/>
+                <w:sz w:val="14"/>
               </w:rPr>
             </w:r>
           </w:p>
@@ -831,7 +831,7 @@
               <w:rPr>
                 <w:rFonts w:ascii="Arial" w:hAnsi="Arial"/>
                 <w:b w:val="0"/>
-                <w:sz w:val="16"/>
+                <w:sz w:val="14"/>
               </w:rPr>
             </w:r>
           </w:p>
@@ -844,7 +844,7 @@
               <w:rPr>
                 <w:rFonts w:ascii="Arial" w:hAnsi="Arial"/>
                 <w:b w:val="0"/>
-                <w:sz w:val="16"/>
+                <w:sz w:val="14"/>
               </w:rPr>
             </w:r>
           </w:p>
@@ -857,7 +857,7 @@
               <w:rPr>
                 <w:rFonts w:ascii="Arial" w:hAnsi="Arial"/>
                 <w:b w:val="0"/>
-                <w:sz w:val="16"/>
+                <w:sz w:val="14"/>
               </w:rPr>
             </w:r>
           </w:p>
@@ -931,7 +931,7 @@
               <w:rPr>
                 <w:rFonts w:ascii="Arial" w:hAnsi="Arial"/>
                 <w:b/>
-                <w:sz w:val="16"/>
+                <w:sz w:val="14"/>
               </w:rPr>
               <w:t>التهيئة الحافزة</w:t>
               <w:br/>
@@ -954,7 +954,7 @@
               <w:rPr>
                 <w:rFonts w:ascii="Arial" w:hAnsi="Arial"/>
                 <w:b w:val="0"/>
-                <w:sz w:val="16"/>
+                <w:sz w:val="14"/>
               </w:rPr>
               <w:t>First Meetings · Page 4, Activity 1</w:t>
               <w:br/>
@@ -970,7 +970,7 @@
               <w:rPr>
                 <w:rFonts w:ascii="Arial" w:hAnsi="Arial"/>
                 <w:b w:val="0"/>
-                <w:sz w:val="16"/>
+                <w:sz w:val="14"/>
               </w:rPr>
             </w:r>
           </w:p>
@@ -983,7 +983,7 @@
               <w:rPr>
                 <w:rFonts w:ascii="Arial" w:hAnsi="Arial"/>
                 <w:b w:val="0"/>
-                <w:sz w:val="16"/>
+                <w:sz w:val="14"/>
               </w:rPr>
             </w:r>
           </w:p>
@@ -996,7 +996,7 @@
               <w:rPr>
                 <w:rFonts w:ascii="Arial" w:hAnsi="Arial"/>
                 <w:b w:val="0"/>
-                <w:sz w:val="16"/>
+                <w:sz w:val="14"/>
               </w:rPr>
             </w:r>
           </w:p>
@@ -1015,7 +1015,7 @@
               <w:rPr>
                 <w:rFonts w:ascii="Arial" w:hAnsi="Arial"/>
                 <w:b w:val="0"/>
-                <w:sz w:val="16"/>
+                <w:sz w:val="14"/>
               </w:rPr>
               <w:t>5 min</w:t>
             </w:r>
@@ -1038,7 +1038,7 @@
               <w:rPr>
                 <w:rFonts w:ascii="Arial" w:hAnsi="Arial"/>
                 <w:b/>
-                <w:sz w:val="16"/>
+                <w:sz w:val="14"/>
               </w:rPr>
               <w:t>الأداة الإلكترونية</w:t>
               <w:br/>
@@ -1061,7 +1061,7 @@
               <w:rPr>
                 <w:rFonts w:ascii="Arial" w:hAnsi="Arial"/>
                 <w:b/>
-                <w:sz w:val="16"/>
+                <w:sz w:val="14"/>
               </w:rPr>
             </w:r>
           </w:p>
@@ -1081,7 +1081,7 @@
               <w:rPr>
                 <w:rFonts w:ascii="Arial" w:hAnsi="Arial"/>
                 <w:b/>
-                <w:sz w:val="16"/>
+                <w:sz w:val="14"/>
               </w:rPr>
               <w:t>الفروق الفردية</w:t>
               <w:br/>
@@ -1104,7 +1104,7 @@
               <w:rPr>
                 <w:rFonts w:ascii="Arial" w:hAnsi="Arial"/>
                 <w:b/>
-                <w:sz w:val="16"/>
+                <w:sz w:val="14"/>
               </w:rPr>
               <w:t>الأنشطة الرئيسية / Main Activities · Roles · AFL</w:t>
             </w:r>
@@ -1125,7 +1125,7 @@
               <w:rPr>
                 <w:rFonts w:ascii="Arial" w:hAnsi="Arial"/>
                 <w:b/>
-                <w:sz w:val="16"/>
+                <w:sz w:val="14"/>
               </w:rPr>
             </w:r>
           </w:p>
@@ -1145,7 +1145,7 @@
               <w:rPr>
                 <w:rFonts w:ascii="Arial" w:hAnsi="Arial"/>
                 <w:b/>
-                <w:sz w:val="16"/>
+                <w:sz w:val="14"/>
               </w:rPr>
               <w:t>التوقيت</w:t>
               <w:br/>
@@ -1170,7 +1170,7 @@
               <w:rPr>
                 <w:rFonts w:ascii="Arial" w:hAnsi="Arial"/>
                 <w:b w:val="0"/>
-                <w:sz w:val="16"/>
+                <w:sz w:val="14"/>
               </w:rPr>
               <w:t>Interactive lesson webpage</w:t>
               <w:br/>
@@ -1188,7 +1188,7 @@
               <w:rPr>
                 <w:rFonts w:ascii="Arial" w:hAnsi="Arial"/>
                 <w:b w:val="0"/>
-                <w:sz w:val="16"/>
+                <w:sz w:val="14"/>
               </w:rPr>
             </w:r>
           </w:p>
@@ -1201,7 +1201,7 @@
               <w:rPr>
                 <w:rFonts w:ascii="Arial" w:hAnsi="Arial"/>
                 <w:b w:val="0"/>
-                <w:sz w:val="16"/>
+                <w:sz w:val="14"/>
               </w:rPr>
             </w:r>
           </w:p>
@@ -1221,7 +1221,7 @@
               <w:rPr>
                 <w:rFonts w:ascii="Arial" w:hAnsi="Arial"/>
                 <w:b w:val="0"/>
-                <w:sz w:val="16"/>
+                <w:sz w:val="14"/>
               </w:rPr>
               <w:t>H</w:t>
             </w:r>
@@ -1241,7 +1241,7 @@
               <w:rPr>
                 <w:rFonts w:ascii="Arial" w:hAnsi="Arial"/>
                 <w:b w:val="0"/>
-                <w:sz w:val="16"/>
+                <w:sz w:val="14"/>
               </w:rPr>
               <w:t>Infer attitudes and explain how stress affects meaning and first impressions.</w:t>
             </w:r>
@@ -1263,26 +1263,26 @@
               <w:rPr>
                 <w:rFonts w:ascii="Arial" w:hAnsi="Arial"/>
                 <w:b w:val="0"/>
-                <w:sz w:val="16"/>
+                <w:sz w:val="14"/>
               </w:rPr>
               <w:t>Main 1 · Expressions · Page 5, Activity 2 (9 min)</w:t>
               <w:br/>
-              <w:t>Listen to Audio 1, match six informal expressions and repeat. AFL: Pair check and sequential reveal.</w:t>
+              <w:t>Purpose: Use six informal expressions accurately. Teacher: Play Audio 1, model pronunciation and monitor pairs. Students: Listen, match, repeat and compare in pairs. Resources: textbook image + Audio 1. AFL: Pair check and sequential reveal.</w:t>
               <w:br/>
               <w:br/>
               <w:t>Main 2 · Predict &amp; Listen · Page 5, Activity 3 (10 min)</w:t>
               <w:br/>
-              <w:t>Predict, listen to Audio 2 twice and justify answers. AFL: Response choices and evidence.</w:t>
+              <w:t>Purpose: Predict and confirm conversation details. Teacher: Elicit predictions, play Audio 2 twice, pause and probe evidence. Students: Predict individually, listen for gist/details, compare and justify in pairs. AFL: Response choices, T/F check and oral evidence.</w:t>
               <w:br/>
               <w:br/>
               <w:t>Main 3 · Stress Rules · Page 6, Activity 4 (8 min)</w:t>
               <w:br/>
-              <w:t>Explain the rule and answer added understanding checks. AFL: Guided questioning.</w:t>
+              <w:t>Purpose: Explain which words receive stress. Teacher: Model stressed speech and ask added check questions. Students: Complete the rule, explain choices and practise in pairs. AFL: Targeted questioning and oral modelling.</w:t>
               <w:br/>
               <w:br/>
               <w:t>Main 4 · Stressed Words · Page 6, Activity 5 (8 min)</w:t>
               <w:br/>
-              <w:t>Complete 16 blanks with Audio 3 and repeat with natural stress. AFL: Sequential reveal and pronunciation monitoring.</w:t>
+              <w:t>Purpose: Identify stressed words in connected speech. Teacher: Play/replay Audio 3, model stress and monitor repetition. Students: Predict 16 blanks, listen, self-correct and repeat in pairs. AFL: Sequential reveal and pronunciation feedback.</w:t>
             </w:r>
           </w:p>
           <w:p>
@@ -1294,7 +1294,7 @@
               <w:rPr>
                 <w:rFonts w:ascii="Arial" w:hAnsi="Arial"/>
                 <w:b w:val="0"/>
-                <w:sz w:val="16"/>
+                <w:sz w:val="14"/>
               </w:rPr>
             </w:r>
           </w:p>
@@ -1307,7 +1307,7 @@
               <w:rPr>
                 <w:rFonts w:ascii="Arial" w:hAnsi="Arial"/>
                 <w:b w:val="0"/>
-                <w:sz w:val="16"/>
+                <w:sz w:val="14"/>
               </w:rPr>
             </w:r>
           </w:p>
@@ -1320,7 +1320,7 @@
               <w:rPr>
                 <w:rFonts w:ascii="Arial" w:hAnsi="Arial"/>
                 <w:b w:val="0"/>
-                <w:sz w:val="16"/>
+                <w:sz w:val="14"/>
               </w:rPr>
             </w:r>
           </w:p>
@@ -1333,7 +1333,7 @@
               <w:rPr>
                 <w:rFonts w:ascii="Arial" w:hAnsi="Arial"/>
                 <w:b w:val="0"/>
-                <w:sz w:val="16"/>
+                <w:sz w:val="14"/>
               </w:rPr>
             </w:r>
           </w:p>
@@ -1346,7 +1346,7 @@
               <w:rPr>
                 <w:rFonts w:ascii="Arial" w:hAnsi="Arial"/>
                 <w:b w:val="0"/>
-                <w:sz w:val="16"/>
+                <w:sz w:val="14"/>
               </w:rPr>
             </w:r>
           </w:p>
@@ -1366,7 +1366,7 @@
               <w:rPr>
                 <w:rFonts w:ascii="Arial" w:hAnsi="Arial"/>
                 <w:b w:val="0"/>
-                <w:sz w:val="16"/>
+                <w:sz w:val="14"/>
               </w:rPr>
               <w:t>35 min</w:t>
             </w:r>
@@ -1380,7 +1380,7 @@
               <w:rPr>
                 <w:rFonts w:ascii="Arial" w:hAnsi="Arial"/>
                 <w:b w:val="0"/>
-                <w:sz w:val="16"/>
+                <w:sz w:val="14"/>
               </w:rPr>
             </w:r>
           </w:p>
@@ -1393,7 +1393,7 @@
               <w:rPr>
                 <w:rFonts w:ascii="Arial" w:hAnsi="Arial"/>
                 <w:b w:val="0"/>
-                <w:sz w:val="16"/>
+                <w:sz w:val="14"/>
               </w:rPr>
             </w:r>
           </w:p>
@@ -1423,7 +1423,7 @@
               <w:rPr>
                 <w:rFonts w:ascii="Arial" w:hAnsi="Arial"/>
                 <w:b w:val="0"/>
-                <w:sz w:val="16"/>
+                <w:sz w:val="14"/>
               </w:rPr>
               <w:t>M</w:t>
             </w:r>
@@ -1443,7 +1443,7 @@
               <w:rPr>
                 <w:rFonts w:ascii="Arial" w:hAnsi="Arial"/>
                 <w:b w:val="0"/>
-                <w:sz w:val="16"/>
+                <w:sz w:val="14"/>
               </w:rPr>
               <w:t>Use expression banks, pair checking and guided evidence prompts.</w:t>
             </w:r>
@@ -1491,7 +1491,7 @@
               <w:rPr>
                 <w:rFonts w:ascii="Arial" w:hAnsi="Arial"/>
                 <w:b w:val="0"/>
-                <w:sz w:val="16"/>
+                <w:sz w:val="14"/>
               </w:rPr>
               <w:t>L</w:t>
             </w:r>
@@ -1511,7 +1511,7 @@
               <w:rPr>
                 <w:rFonts w:ascii="Arial" w:hAnsi="Arial"/>
                 <w:b w:val="0"/>
-                <w:sz w:val="16"/>
+                <w:sz w:val="14"/>
               </w:rPr>
               <w:t>Use images, matching choices, repeated audio and sentence frames.</w:t>
             </w:r>
@@ -1551,7 +1551,7 @@
               <w:rPr>
                 <w:rFonts w:ascii="Arial" w:hAnsi="Arial"/>
                 <w:b/>
-                <w:sz w:val="16"/>
+                <w:sz w:val="14"/>
               </w:rPr>
               <w:t>الختام</w:t>
               <w:br/>
@@ -1574,7 +1574,7 @@
               <w:rPr>
                 <w:rFonts w:ascii="Arial" w:hAnsi="Arial"/>
                 <w:b w:val="0"/>
-                <w:sz w:val="16"/>
+                <w:sz w:val="14"/>
               </w:rPr>
               <w:t>Exit Ticket (3 min): Stress Detective group challenge.</w:t>
               <w:br/>
@@ -1590,7 +1590,7 @@
               <w:rPr>
                 <w:rFonts w:ascii="Arial" w:hAnsi="Arial"/>
                 <w:b w:val="0"/>
-                <w:sz w:val="16"/>
+                <w:sz w:val="14"/>
               </w:rPr>
             </w:r>
           </w:p>
@@ -1603,7 +1603,7 @@
               <w:rPr>
                 <w:rFonts w:ascii="Arial" w:hAnsi="Arial"/>
                 <w:b w:val="0"/>
-                <w:sz w:val="16"/>
+                <w:sz w:val="14"/>
               </w:rPr>
             </w:r>
           </w:p>
@@ -1616,7 +1616,7 @@
               <w:rPr>
                 <w:rFonts w:ascii="Arial" w:hAnsi="Arial"/>
                 <w:b w:val="0"/>
-                <w:sz w:val="16"/>
+                <w:sz w:val="14"/>
               </w:rPr>
             </w:r>
           </w:p>
@@ -1635,7 +1635,7 @@
               <w:rPr>
                 <w:rFonts w:ascii="Arial" w:hAnsi="Arial"/>
                 <w:b w:val="0"/>
-                <w:sz w:val="16"/>
+                <w:sz w:val="14"/>
               </w:rPr>
               <w:t>5 min</w:t>
             </w:r>
@@ -1659,7 +1659,7 @@
               <w:rPr>
                 <w:rFonts w:ascii="Arial" w:hAnsi="Arial"/>
                 <w:b/>
-                <w:sz w:val="16"/>
+                <w:sz w:val="14"/>
               </w:rPr>
               <w:t>مهارات التعلم</w:t>
               <w:br/>
@@ -1675,7 +1675,7 @@
               <w:rPr>
                 <w:rFonts w:ascii="Arial" w:hAnsi="Arial"/>
                 <w:b w:val="0"/>
-                <w:sz w:val="16"/>
+                <w:sz w:val="14"/>
               </w:rPr>
             </w:r>
           </w:p>
@@ -1695,7 +1695,7 @@
               <w:rPr>
                 <w:rFonts w:ascii="Arial" w:hAnsi="Arial"/>
                 <w:b w:val="0"/>
-                <w:sz w:val="16"/>
+                <w:sz w:val="14"/>
               </w:rPr>
               <w:t>Critical Thinking · Clear Communication · Collaboration · Listening · Digital Literacy</w:t>
             </w:r>
@@ -1709,7 +1709,7 @@
               <w:rPr>
                 <w:rFonts w:ascii="Arial" w:hAnsi="Arial"/>
                 <w:b w:val="0"/>
-                <w:sz w:val="16"/>
+                <w:sz w:val="14"/>
               </w:rPr>
             </w:r>
           </w:p>
@@ -1722,7 +1722,7 @@
               <w:rPr>
                 <w:rFonts w:ascii="Arial" w:hAnsi="Arial"/>
                 <w:b w:val="0"/>
-                <w:sz w:val="16"/>
+                <w:sz w:val="14"/>
               </w:rPr>
             </w:r>
           </w:p>
@@ -1735,7 +1735,7 @@
               <w:rPr>
                 <w:rFonts w:ascii="Arial" w:hAnsi="Arial"/>
                 <w:b w:val="0"/>
-                <w:sz w:val="16"/>
+                <w:sz w:val="14"/>
               </w:rPr>
             </w:r>
           </w:p>
@@ -1758,7 +1758,7 @@
               <w:rPr>
                 <w:rFonts w:ascii="Arial" w:hAnsi="Arial"/>
                 <w:b/>
-                <w:sz w:val="16"/>
+                <w:sz w:val="14"/>
               </w:rPr>
               <w:t>ربط مع مواد أخرى</w:t>
               <w:br/>
@@ -1774,7 +1774,7 @@
               <w:rPr>
                 <w:rFonts w:ascii="Arial" w:hAnsi="Arial"/>
                 <w:b w:val="0"/>
-                <w:sz w:val="16"/>
+                <w:sz w:val="14"/>
               </w:rPr>
             </w:r>
           </w:p>
@@ -1794,7 +1794,7 @@
               <w:rPr>
                 <w:rFonts w:ascii="Arial" w:hAnsi="Arial"/>
                 <w:b w:val="0"/>
-                <w:sz w:val="16"/>
+                <w:sz w:val="14"/>
               </w:rPr>
               <w:t>Digital Citizenship / Social Studies: respectful first meetings, online identity and inclusive communication.</w:t>
             </w:r>
@@ -1808,7 +1808,7 @@
               <w:rPr>
                 <w:rFonts w:ascii="Arial" w:hAnsi="Arial"/>
                 <w:b w:val="0"/>
-                <w:sz w:val="16"/>
+                <w:sz w:val="14"/>
               </w:rPr>
             </w:r>
           </w:p>
@@ -1821,7 +1821,7 @@
               <w:rPr>
                 <w:rFonts w:ascii="Arial" w:hAnsi="Arial"/>
                 <w:b w:val="0"/>
-                <w:sz w:val="16"/>
+                <w:sz w:val="14"/>
               </w:rPr>
             </w:r>
           </w:p>
@@ -1834,7 +1834,7 @@
               <w:rPr>
                 <w:rFonts w:ascii="Arial" w:hAnsi="Arial"/>
                 <w:b w:val="0"/>
-                <w:sz w:val="16"/>
+                <w:sz w:val="14"/>
               </w:rPr>
             </w:r>
           </w:p>
@@ -1857,7 +1857,7 @@
               <w:rPr>
                 <w:rFonts w:ascii="Arial" w:hAnsi="Arial"/>
                 <w:b/>
-                <w:sz w:val="16"/>
+                <w:sz w:val="14"/>
               </w:rPr>
               <w:t>ثقافة دولة الإمارات ورؤية 2031</w:t>
               <w:br/>
@@ -1873,7 +1873,7 @@
               <w:rPr>
                 <w:rFonts w:ascii="Arial" w:hAnsi="Arial"/>
                 <w:b w:val="0"/>
-                <w:sz w:val="16"/>
+                <w:sz w:val="14"/>
               </w:rPr>
             </w:r>
           </w:p>
@@ -1893,7 +1893,7 @@
               <w:rPr>
                 <w:rFonts w:ascii="Arial" w:hAnsi="Arial"/>
                 <w:b w:val="0"/>
-                <w:sz w:val="16"/>
+                <w:sz w:val="14"/>
               </w:rPr>
               <w:t>Students model the UAE values of tolerance, hospitality and respectful communication when welcoming people from diverse backgrounds.</w:t>
             </w:r>
@@ -1907,7 +1907,7 @@
               <w:rPr>
                 <w:rFonts w:ascii="Arial" w:hAnsi="Arial"/>
                 <w:b w:val="0"/>
-                <w:sz w:val="16"/>
+                <w:sz w:val="14"/>
               </w:rPr>
             </w:r>
           </w:p>
@@ -1920,7 +1920,7 @@
               <w:rPr>
                 <w:rFonts w:ascii="Arial" w:hAnsi="Arial"/>
                 <w:b w:val="0"/>
-                <w:sz w:val="16"/>
+                <w:sz w:val="14"/>
               </w:rPr>
             </w:r>
           </w:p>
@@ -1933,7 +1933,7 @@
               <w:rPr>
                 <w:rFonts w:ascii="Arial" w:hAnsi="Arial"/>
                 <w:b w:val="0"/>
-                <w:sz w:val="16"/>
+                <w:sz w:val="14"/>
               </w:rPr>
             </w:r>
           </w:p>
@@ -2327,7 +2327,7 @@
     <w:rsid w:val="00FC693F"/>
     <w:rPr>
       <w:rFonts w:ascii="Arial" w:hAnsi="Arial"/>
-      <w:sz w:val="16"/>
+      <w:sz w:val="14"/>
     </w:rPr>
   </w:style>
   <w:style w:type="paragraph" w:styleId="Header">

</xml_diff>

<commit_message>
Use permanent GitHub lesson links in all lesson plans
</commit_message>
<xml_diff>
--- a/Term-1/Grade-10/Chapter-1-Listening-1-Nice-to-Meet-You-Part-1/assets/Lesson-Plan-Nice-to-Meet-You-Part-1.docx
+++ b/Term-1/Grade-10/Chapter-1-Listening-1-Nice-to-Meet-You-Part-1/assets/Lesson-Plan-Nice-to-Meet-You-Part-1.docx
@@ -259,16 +259,18 @@
               <w:spacing w:after="0"/>
             </w:pPr>
             <w:r/>
-            <w:r>
-              <w:rPr>
-                <w:rFonts w:ascii="Arial" w:hAnsi="Arial"/>
-                <w:b w:val="0"/>
-                <w:sz w:val="14"/>
-              </w:rPr>
-              <w:t>First meetings, informal expressions and stressed words</w:t>
-              <w:br/>
-              <w:t>OPEN INTERACTIVE LESSON ↗</w:t>
-            </w:r>
+            <w:hyperlink r:id="rId9">
+              <w:r>
+                <w:rPr>
+                  <w:rFonts w:ascii="Arial" w:hAnsi="Arial"/>
+                  <w:b w:val="0"/>
+                  <w:sz w:val="14"/>
+                </w:rPr>
+                <w:t>First meetings, informal expressions and stressed words</w:t>
+                <w:br/>
+                <w:t>OPEN INTERACTIVE LESSON ↗</w:t>
+              </w:r>
+            </w:hyperlink>
           </w:p>
           <w:p>
             <w:pPr>

</xml_diff>